<commit_message>
feat: harden construction multi-agent workflow
</commit_message>
<xml_diff>
--- a/mULTIaGENTS.docx
+++ b/mULTIaGENTS.docx
@@ -1579,6 +1579,9 @@
     <w:p>
       <w:pPr>
         <w:pStyle w:val="NormalWeb"/>
+        <w:pBdr>
+          <w:bottom w:val="single" w:sz="6" w:space="1" w:color="auto"/>
+        </w:pBdr>
       </w:pPr>
       <w:r>
         <w:rPr>
@@ -1650,6 +1653,746 @@
           <w:iCs/>
         </w:rPr>
         <w:t>)</w:t>
+      </w:r>
+    </w:p>
+    <w:p>
+      <w:r>
+        <w:t>cd "D:\Project Data\Trials\Final XAI\Passant\</w:t>
+      </w:r>
+      <w:proofErr w:type="spellStart"/>
+      <w:r>
+        <w:t>MultiAgents</w:t>
+      </w:r>
+      <w:r>
+        <w:t>"</w:t>
+      </w:r>
+      <w:r>
+        <w:t>X</w:t>
+      </w:r>
+      <w:proofErr w:type="spellEnd"/>
+      <w:r>
+        <w:br/>
+      </w:r>
+      <w:r>
+        <w:t>"D:\Project Data\Trials\Final XAI\Passant\</w:t>
+      </w:r>
+      <w:proofErr w:type="spellStart"/>
+      <w:r>
+        <w:t>MultiAgents</w:t>
+      </w:r>
+      <w:proofErr w:type="spellEnd"/>
+      <w:r>
+        <w:t>"</w:t>
+      </w:r>
+      <w:r>
+        <w:br/>
+        <w:t>------------------------------------------------</w:t>
+      </w:r>
+    </w:p>
+    <w:p>
+      <w:pPr>
+        <w:pStyle w:val="Heading3"/>
+      </w:pPr>
+      <w:r>
+        <w:rPr>
+          <w:rFonts w:ascii="Segoe UI Emoji" w:hAnsi="Segoe UI Emoji" w:cs="Segoe UI Emoji"/>
+        </w:rPr>
+        <w:lastRenderedPageBreak/>
+        <w:t>🚀</w:t>
+      </w:r>
+      <w:r>
+        <w:t xml:space="preserve"> LinkedIn Post Draft</w:t>
+      </w:r>
+    </w:p>
+    <w:p>
+      <w:pPr>
+        <w:pStyle w:val="NormalWeb"/>
+      </w:pPr>
+      <w:r>
+        <w:rPr>
+          <w:b/>
+          <w:bCs/>
+        </w:rPr>
+        <w:t>Headline Idea:</w:t>
+      </w:r>
+      <w:r>
+        <w:t xml:space="preserve"> </w:t>
+      </w:r>
+      <w:r>
+        <w:rPr>
+          <w:i/>
+          <w:iCs/>
+        </w:rPr>
+        <w:t xml:space="preserve">Building a Privacy-Preserving, Local Multi-Agent AI System for Construction Management </w:t>
+      </w:r>
+      <w:r>
+        <w:rPr>
+          <w:rFonts w:ascii="Segoe UI Emoji" w:hAnsi="Segoe UI Emoji" w:cs="Segoe UI Emoji"/>
+          <w:i/>
+          <w:iCs/>
+        </w:rPr>
+        <w:t>🏗</w:t>
+      </w:r>
+      <w:r>
+        <w:rPr>
+          <w:i/>
+          <w:iCs/>
+        </w:rPr>
+        <w:t>️</w:t>
+      </w:r>
+      <w:r>
+        <w:rPr>
+          <w:rFonts w:ascii="Segoe UI Emoji" w:hAnsi="Segoe UI Emoji" w:cs="Segoe UI Emoji"/>
+          <w:i/>
+          <w:iCs/>
+        </w:rPr>
+        <w:t>🤖</w:t>
+      </w:r>
+    </w:p>
+    <w:p>
+      <w:pPr>
+        <w:pStyle w:val="NormalWeb"/>
+      </w:pPr>
+      <w:r>
+        <w:t xml:space="preserve">I'm excited to share my latest project: </w:t>
+      </w:r>
+      <w:r>
+        <w:rPr>
+          <w:b/>
+          <w:bCs/>
+        </w:rPr>
+        <w:t>A Privacy-Preserving Multi-Agent System (MAS) for Construction Engineering &amp; Project Management</w:t>
+      </w:r>
+      <w:r>
+        <w:t xml:space="preserve">! </w:t>
+      </w:r>
+      <w:r>
+        <w:rPr>
+          <w:rFonts w:ascii="Segoe UI Emoji" w:hAnsi="Segoe UI Emoji" w:cs="Segoe UI Emoji"/>
+        </w:rPr>
+        <w:t>🛠</w:t>
+      </w:r>
+      <w:r>
+        <w:t>️</w:t>
+      </w:r>
+    </w:p>
+    <w:p>
+      <w:pPr>
+        <w:pStyle w:val="NormalWeb"/>
+      </w:pPr>
+      <w:r>
+        <w:t xml:space="preserve">In large-scale construction, managing structural design changes, procurement lead times, and critical path schedules is notoriously complex. Traditional LLM workflows often fail here due to two main challenges: </w:t>
+      </w:r>
+      <w:r>
+        <w:rPr>
+          <w:b/>
+          <w:bCs/>
+        </w:rPr>
+        <w:t>data privacy risks</w:t>
+      </w:r>
+      <w:r>
+        <w:t xml:space="preserve"> with cloud APIs and </w:t>
+      </w:r>
+      <w:r>
+        <w:rPr>
+          <w:b/>
+          <w:bCs/>
+        </w:rPr>
+        <w:t>hallucinations</w:t>
+      </w:r>
+      <w:r>
+        <w:t xml:space="preserve"> when calculating deterministic schedules.</w:t>
+      </w:r>
+    </w:p>
+    <w:p>
+      <w:pPr>
+        <w:pStyle w:val="NormalWeb"/>
+      </w:pPr>
+      <w:r>
+        <w:t xml:space="preserve">To solve this, I engineered a </w:t>
+      </w:r>
+      <w:r>
+        <w:rPr>
+          <w:b/>
+          <w:bCs/>
+        </w:rPr>
+        <w:t>100% offline, privacy-first multi-agent pipeline</w:t>
+      </w:r>
+      <w:r>
+        <w:t xml:space="preserve"> powered by local LLMs, Vector RAG, and deterministic graph theory.</w:t>
+      </w:r>
+    </w:p>
+    <w:p>
+      <w:pPr>
+        <w:pStyle w:val="Heading3"/>
+      </w:pPr>
+      <w:r>
+        <w:rPr>
+          <w:rFonts w:ascii="Segoe UI Emoji" w:hAnsi="Segoe UI Emoji" w:cs="Segoe UI Emoji"/>
+        </w:rPr>
+        <w:t>🌟</w:t>
+      </w:r>
+      <w:r>
+        <w:t xml:space="preserve"> Key Architecture &amp; Upgrades:</w:t>
+      </w:r>
+    </w:p>
+    <w:p>
+      <w:pPr>
+        <w:pStyle w:val="NormalWeb"/>
+      </w:pPr>
+      <w:r>
+        <w:t>1️</w:t>
+      </w:r>
+      <w:r>
+        <w:rPr>
+          <w:rFonts w:ascii="Tahoma" w:hAnsi="Tahoma" w:cs="Tahoma"/>
+        </w:rPr>
+        <w:t>⃣</w:t>
+      </w:r>
+      <w:r>
+        <w:t xml:space="preserve"> </w:t>
+      </w:r>
+      <w:r>
+        <w:rPr>
+          <w:b/>
+          <w:bCs/>
+        </w:rPr>
+        <w:t>Local &amp; Private Intelligence:</w:t>
+      </w:r>
+      <w:r>
+        <w:t xml:space="preserve"> Powered by </w:t>
+      </w:r>
+      <w:r>
+        <w:rPr>
+          <w:b/>
+          <w:bCs/>
+        </w:rPr>
+        <w:t xml:space="preserve">Llama 3.1 via </w:t>
+      </w:r>
+      <w:proofErr w:type="spellStart"/>
+      <w:r>
+        <w:rPr>
+          <w:b/>
+          <w:bCs/>
+        </w:rPr>
+        <w:t>Ollama</w:t>
+      </w:r>
+      <w:proofErr w:type="spellEnd"/>
+      <w:r>
+        <w:t>. Zero API costs, zero data leaving the local machine, and complete compliance with proprietary project data privacy.</w:t>
+      </w:r>
+    </w:p>
+    <w:p>
+      <w:pPr>
+        <w:pStyle w:val="NormalWeb"/>
+      </w:pPr>
+      <w:r>
+        <w:t>2️</w:t>
+      </w:r>
+      <w:r>
+        <w:rPr>
+          <w:rFonts w:ascii="Tahoma" w:hAnsi="Tahoma" w:cs="Tahoma"/>
+        </w:rPr>
+        <w:t>⃣</w:t>
+      </w:r>
+      <w:r>
+        <w:t xml:space="preserve"> </w:t>
+      </w:r>
+      <w:r>
+        <w:rPr>
+          <w:b/>
+          <w:bCs/>
+        </w:rPr>
+        <w:t>Grounding via Vector RAG:</w:t>
+      </w:r>
+      <w:r>
+        <w:t xml:space="preserve"> Integrated a Retrieval-Augmented Generation layer (</w:t>
+      </w:r>
+      <w:r>
+        <w:rPr>
+          <w:rStyle w:val="HTMLCode"/>
+        </w:rPr>
+        <w:t>rag_engine.py</w:t>
+      </w:r>
+      <w:r>
+        <w:t>) that cross-references unstructured site inspection notes against standard structural codes (</w:t>
+      </w:r>
+      <w:r>
+        <w:rPr>
+          <w:b/>
+          <w:bCs/>
+        </w:rPr>
+        <w:t>ACI 318, BS 8110, Eurocode</w:t>
+      </w:r>
+      <w:r>
+        <w:t xml:space="preserve">) before extracting design specifications into structured </w:t>
+      </w:r>
+      <w:proofErr w:type="spellStart"/>
+      <w:r>
+        <w:t>Pydantic</w:t>
+      </w:r>
+      <w:proofErr w:type="spellEnd"/>
+      <w:r>
+        <w:t xml:space="preserve"> schemas.</w:t>
+      </w:r>
+    </w:p>
+    <w:p>
+      <w:pPr>
+        <w:pStyle w:val="NormalWeb"/>
+      </w:pPr>
+      <w:r>
+        <w:t>3️</w:t>
+      </w:r>
+      <w:r>
+        <w:rPr>
+          <w:rFonts w:ascii="Tahoma" w:hAnsi="Tahoma" w:cs="Tahoma"/>
+        </w:rPr>
+        <w:t>⃣</w:t>
+      </w:r>
+      <w:r>
+        <w:t xml:space="preserve"> </w:t>
+      </w:r>
+      <w:r>
+        <w:rPr>
+          <w:b/>
+          <w:bCs/>
+        </w:rPr>
+        <w:t>Deterministic Critical Path Method (CPM):</w:t>
+      </w:r>
+      <w:r>
+        <w:t xml:space="preserve"> Replaced LLM estimation with a </w:t>
+      </w:r>
+      <w:proofErr w:type="spellStart"/>
+      <w:r>
+        <w:rPr>
+          <w:b/>
+          <w:bCs/>
+        </w:rPr>
+        <w:t>NetworkX</w:t>
+      </w:r>
+      <w:proofErr w:type="spellEnd"/>
+      <w:r>
+        <w:rPr>
+          <w:b/>
+          <w:bCs/>
+        </w:rPr>
+        <w:t xml:space="preserve"> Directed Acyclic Graph (DAG)</w:t>
+      </w:r>
+      <w:r>
+        <w:t xml:space="preserve"> solver (</w:t>
+      </w:r>
+      <w:r>
+        <w:rPr>
+          <w:rStyle w:val="HTMLCode"/>
+        </w:rPr>
+        <w:t>cpm_solver.py</w:t>
+      </w:r>
+      <w:r>
+        <w:t>). Supplier lead times feed directly into topological float calculations to compute exact project completion delays.</w:t>
+      </w:r>
+    </w:p>
+    <w:p>
+      <w:pPr>
+        <w:pStyle w:val="NormalWeb"/>
+      </w:pPr>
+      <w:r>
+        <w:t>4️</w:t>
+      </w:r>
+      <w:r>
+        <w:rPr>
+          <w:rFonts w:ascii="Tahoma" w:hAnsi="Tahoma" w:cs="Tahoma"/>
+        </w:rPr>
+        <w:t>⃣</w:t>
+      </w:r>
+      <w:r>
+        <w:t xml:space="preserve"> </w:t>
+      </w:r>
+      <w:r>
+        <w:rPr>
+          <w:b/>
+          <w:bCs/>
+        </w:rPr>
+        <w:t>Full Auditability &amp; Lineage:</w:t>
+      </w:r>
+      <w:r>
+        <w:t xml:space="preserve"> Every decision across the </w:t>
+      </w:r>
+      <w:r>
+        <w:rPr>
+          <w:b/>
+          <w:bCs/>
+        </w:rPr>
+        <w:t>Design</w:t>
+      </w:r>
+      <w:r>
+        <w:t xml:space="preserve">, </w:t>
+      </w:r>
+      <w:r>
+        <w:rPr>
+          <w:b/>
+          <w:bCs/>
+        </w:rPr>
+        <w:t>Procurement</w:t>
+      </w:r>
+      <w:r>
+        <w:t xml:space="preserve">, and </w:t>
+      </w:r>
+      <w:r>
+        <w:rPr>
+          <w:b/>
+          <w:bCs/>
+        </w:rPr>
+        <w:t>Scheduling</w:t>
+      </w:r>
+      <w:r>
+        <w:t xml:space="preserve"> agents is automatically persisted in an </w:t>
+      </w:r>
+      <w:r>
+        <w:rPr>
+          <w:b/>
+          <w:bCs/>
+        </w:rPr>
+        <w:t>SQLite</w:t>
+      </w:r>
+      <w:r>
+        <w:t xml:space="preserve"> database (</w:t>
+      </w:r>
+      <w:proofErr w:type="spellStart"/>
+      <w:r>
+        <w:rPr>
+          <w:rStyle w:val="HTMLCode"/>
+        </w:rPr>
+        <w:t>construction_mas.db</w:t>
+      </w:r>
+      <w:proofErr w:type="spellEnd"/>
+      <w:r>
+        <w:t xml:space="preserve">), exposed through an interactive </w:t>
+      </w:r>
+      <w:proofErr w:type="spellStart"/>
+      <w:r>
+        <w:rPr>
+          <w:b/>
+          <w:bCs/>
+        </w:rPr>
+        <w:t>Streamlit</w:t>
+      </w:r>
+      <w:proofErr w:type="spellEnd"/>
+      <w:r>
+        <w:t xml:space="preserve"> dashboard.</w:t>
+      </w:r>
+    </w:p>
+    <w:p>
+      <w:pPr>
+        <w:pStyle w:val="NormalWeb"/>
+      </w:pPr>
+      <w:r>
+        <w:rPr>
+          <w:rFonts w:ascii="Segoe UI Emoji" w:hAnsi="Segoe UI Emoji" w:cs="Segoe UI Emoji"/>
+        </w:rPr>
+        <w:t>💡</w:t>
+      </w:r>
+      <w:r>
+        <w:t xml:space="preserve"> </w:t>
+      </w:r>
+      <w:r>
+        <w:rPr>
+          <w:b/>
+          <w:bCs/>
+        </w:rPr>
+        <w:t>Tech Stack:</w:t>
+      </w:r>
+      <w:r>
+        <w:t xml:space="preserve"> Python | </w:t>
+      </w:r>
+      <w:proofErr w:type="spellStart"/>
+      <w:r>
+        <w:t>Ollama</w:t>
+      </w:r>
+      <w:proofErr w:type="spellEnd"/>
+      <w:r>
+        <w:t xml:space="preserve"> (Llama 3.1) | </w:t>
+      </w:r>
+      <w:proofErr w:type="spellStart"/>
+      <w:r>
+        <w:t>Streamlit</w:t>
+      </w:r>
+      <w:proofErr w:type="spellEnd"/>
+      <w:r>
+        <w:t xml:space="preserve"> | </w:t>
+      </w:r>
+      <w:proofErr w:type="spellStart"/>
+      <w:r>
+        <w:t>NetworkX</w:t>
+      </w:r>
+      <w:proofErr w:type="spellEnd"/>
+      <w:r>
+        <w:t xml:space="preserve"> | SQLite | </w:t>
+      </w:r>
+      <w:proofErr w:type="spellStart"/>
+      <w:r>
+        <w:t>Pydantic</w:t>
+      </w:r>
+      <w:proofErr w:type="spellEnd"/>
+      <w:r>
+        <w:t xml:space="preserve"> | RAG</w:t>
+      </w:r>
+    </w:p>
+    <w:p>
+      <w:pPr>
+        <w:pStyle w:val="NormalWeb"/>
+      </w:pPr>
+      <w:r>
+        <w:rPr>
+          <w:rFonts w:ascii="Segoe UI Emoji" w:hAnsi="Segoe UI Emoji" w:cs="Segoe UI Emoji"/>
+        </w:rPr>
+        <w:t>📂</w:t>
+      </w:r>
+      <w:r>
+        <w:t xml:space="preserve"> </w:t>
+      </w:r>
+      <w:r>
+        <w:rPr>
+          <w:b/>
+          <w:bCs/>
+        </w:rPr>
+        <w:t>Explore the Source Code &amp; Run Locally:</w:t>
+      </w:r>
+    </w:p>
+    <w:p>
+      <w:pPr>
+        <w:pStyle w:val="NormalWeb"/>
+      </w:pPr>
+      <w:r>
+        <w:rPr>
+          <w:rFonts w:ascii="Segoe UI Emoji" w:hAnsi="Segoe UI Emoji" w:cs="Segoe UI Emoji"/>
+        </w:rPr>
+        <w:t>🔗</w:t>
+      </w:r>
+      <w:r>
+        <w:t xml:space="preserve"> GitHub Repo: </w:t>
+      </w:r>
+      <w:hyperlink r:id="rId5" w:tgtFrame="_blank" w:history="1">
+        <w:r>
+          <w:rPr>
+            <w:rStyle w:val="Hyperlink"/>
+          </w:rPr>
+          <w:t>https://github.com/passantabdou23-svg/Construction-MultiAgent-System</w:t>
+        </w:r>
+      </w:hyperlink>
+    </w:p>
+    <w:p>
+      <w:pPr>
+        <w:pStyle w:val="NormalWeb"/>
+      </w:pPr>
+      <w:r>
+        <w:t xml:space="preserve">I’d love to hear your thoughts, feedback, or ideas on multi-agent workflows in engineering! </w:t>
+      </w:r>
+      <w:r>
+        <w:rPr>
+          <w:rFonts w:ascii="Segoe UI Emoji" w:hAnsi="Segoe UI Emoji" w:cs="Segoe UI Emoji"/>
+        </w:rPr>
+        <w:t>👇</w:t>
+      </w:r>
+    </w:p>
+    <w:p>
+      <w:pPr>
+        <w:pStyle w:val="NormalWeb"/>
+      </w:pPr>
+      <w:r>
+        <w:t>#</w:t>
+      </w:r>
+      <w:proofErr w:type="spellStart"/>
+      <w:r>
+        <w:t>ArtificialIntelligence</w:t>
+      </w:r>
+      <w:proofErr w:type="spellEnd"/>
+      <w:r>
+        <w:t xml:space="preserve"> #</w:t>
+      </w:r>
+      <w:proofErr w:type="spellStart"/>
+      <w:r>
+        <w:t>MultiAgentSystems</w:t>
+      </w:r>
+      <w:proofErr w:type="spellEnd"/>
+      <w:r>
+        <w:t xml:space="preserve"> #</w:t>
+      </w:r>
+      <w:proofErr w:type="spellStart"/>
+      <w:r>
+        <w:t>GenerativeAI</w:t>
+      </w:r>
+      <w:proofErr w:type="spellEnd"/>
+      <w:r>
+        <w:t xml:space="preserve"> #Python #</w:t>
+      </w:r>
+      <w:proofErr w:type="spellStart"/>
+      <w:r>
+        <w:t>MachineLearning</w:t>
+      </w:r>
+      <w:proofErr w:type="spellEnd"/>
+      <w:r>
+        <w:t xml:space="preserve"> #</w:t>
+      </w:r>
+      <w:proofErr w:type="spellStart"/>
+      <w:r>
+        <w:t>ConstructionTech</w:t>
+      </w:r>
+      <w:proofErr w:type="spellEnd"/>
+      <w:r>
+        <w:t xml:space="preserve"> #</w:t>
+      </w:r>
+      <w:proofErr w:type="spellStart"/>
+      <w:r>
+        <w:t>CivilEngineering</w:t>
+      </w:r>
+      <w:proofErr w:type="spellEnd"/>
+      <w:r>
+        <w:t xml:space="preserve"> #</w:t>
+      </w:r>
+      <w:proofErr w:type="spellStart"/>
+      <w:r>
+        <w:t>LocalLLM</w:t>
+      </w:r>
+      <w:proofErr w:type="spellEnd"/>
+      <w:r>
+        <w:t xml:space="preserve"> #</w:t>
+      </w:r>
+      <w:proofErr w:type="spellStart"/>
+      <w:r>
+        <w:t>Ollama</w:t>
+      </w:r>
+      <w:proofErr w:type="spellEnd"/>
+      <w:r>
+        <w:t xml:space="preserve"> #</w:t>
+      </w:r>
+      <w:proofErr w:type="spellStart"/>
+      <w:r>
+        <w:t>GraphTheory</w:t>
+      </w:r>
+      <w:proofErr w:type="spellEnd"/>
+      <w:r>
+        <w:t xml:space="preserve"> #</w:t>
+      </w:r>
+      <w:proofErr w:type="spellStart"/>
+      <w:r>
+        <w:t>OpenSource</w:t>
+      </w:r>
+      <w:proofErr w:type="spellEnd"/>
+    </w:p>
+    <w:p>
+      <w:pPr>
+        <w:pStyle w:val="Heading3"/>
+      </w:pPr>
+      <w:r>
+        <w:rPr>
+          <w:rFonts w:ascii="Segoe UI Emoji" w:hAnsi="Segoe UI Emoji" w:cs="Segoe UI Emoji"/>
+        </w:rPr>
+        <w:lastRenderedPageBreak/>
+        <w:t>💡</w:t>
+      </w:r>
+      <w:r>
+        <w:t xml:space="preserve"> Tips Before Posting:</w:t>
+      </w:r>
+    </w:p>
+    <w:p>
+      <w:pPr>
+        <w:pStyle w:val="NormalWeb"/>
+        <w:numPr>
+          <w:ilvl w:val="0"/>
+          <w:numId w:val="4"/>
+        </w:numPr>
+      </w:pPr>
+      <w:r>
+        <w:rPr>
+          <w:b/>
+          <w:bCs/>
+        </w:rPr>
+        <w:t>Attach Screenshots:</w:t>
+      </w:r>
+      <w:r>
+        <w:t xml:space="preserve"> Include the screenshot of your </w:t>
+      </w:r>
+      <w:proofErr w:type="spellStart"/>
+      <w:r>
+        <w:rPr>
+          <w:b/>
+          <w:bCs/>
+        </w:rPr>
+        <w:t>Streamlit</w:t>
+      </w:r>
+      <w:proofErr w:type="spellEnd"/>
+      <w:r>
+        <w:rPr>
+          <w:b/>
+          <w:bCs/>
+        </w:rPr>
+        <w:t xml:space="preserve"> Dashboard</w:t>
+      </w:r>
+      <w:r>
+        <w:t xml:space="preserve"> and your </w:t>
+      </w:r>
+      <w:r>
+        <w:rPr>
+          <w:b/>
+          <w:bCs/>
+        </w:rPr>
+        <w:t>Terminal Pipeline Run</w:t>
+      </w:r>
+      <w:r>
+        <w:t xml:space="preserve"> in the post—visuals increase reach by over 3x on LinkedIn!</w:t>
+      </w:r>
+    </w:p>
+    <w:p>
+      <w:pPr>
+        <w:pStyle w:val="NormalWeb"/>
+        <w:numPr>
+          <w:ilvl w:val="0"/>
+          <w:numId w:val="4"/>
+        </w:numPr>
+      </w:pPr>
+      <w:r>
+        <w:rPr>
+          <w:b/>
+          <w:bCs/>
+        </w:rPr>
+        <w:t>Tag Relevant Topics/Tools:</w:t>
+      </w:r>
+      <w:r>
+        <w:t xml:space="preserve"> You can tag </w:t>
+      </w:r>
+      <w:r>
+        <w:rPr>
+          <w:rStyle w:val="HTMLCode"/>
+        </w:rPr>
+        <w:t>@</w:t>
+      </w:r>
+      <w:proofErr w:type="spellStart"/>
+      <w:r>
+        <w:rPr>
+          <w:rStyle w:val="HTMLCode"/>
+        </w:rPr>
+        <w:t>Streamlit</w:t>
+      </w:r>
+      <w:proofErr w:type="spellEnd"/>
+      <w:r>
+        <w:t xml:space="preserve"> or </w:t>
+      </w:r>
+      <w:r>
+        <w:rPr>
+          <w:rStyle w:val="HTMLCode"/>
+        </w:rPr>
+        <w:t>@</w:t>
+      </w:r>
+      <w:proofErr w:type="spellStart"/>
+      <w:r>
+        <w:rPr>
+          <w:rStyle w:val="HTMLCode"/>
+        </w:rPr>
+        <w:t>Ollama</w:t>
+      </w:r>
+      <w:proofErr w:type="spellEnd"/>
+      <w:r>
+        <w:t xml:space="preserve"> if you want extra visibility.</w:t>
       </w:r>
     </w:p>
     <w:p>
@@ -1669,6 +2412,119 @@
 <file path=word/numbering.xml><?xml version="1.0" encoding="utf-8"?>
 <w:numbering xmlns:wpc="http://schemas.microsoft.com/office/word/2010/wordprocessingCanvas" xmlns:cx="http://schemas.microsoft.com/office/drawing/2014/chartex" xmlns:cx1="http://schemas.microsoft.com/office/drawing/2015/9/8/chartex" xmlns:cx2="http://schemas.microsoft.com/office/drawing/2015/10/21/chartex" xmlns:cx3="http://schemas.microsoft.com/office/drawing/2016/5/9/chartex" xmlns:cx4="http://schemas.microsoft.com/office/drawing/2016/5/10/chartex" xmlns:cx5="http://schemas.microsoft.com/office/drawing/2016/5/11/chartex" xmlns:cx6="http://schemas.microsoft.com/office/drawing/2016/5/12/chartex" xmlns:cx7="http://schemas.microsoft.com/office/drawing/2016/5/13/chartex" xmlns:cx8="http://schemas.microsoft.com/office/drawing/2016/5/14/chartex" xmlns:mc="http://schemas.openxmlformats.org/markup-compatibility/2006" xmlns:aink="http://schemas.microsoft.com/office/drawing/2016/ink" xmlns:am3d="http://schemas.microsoft.com/office/drawing/2017/model3d" xmlns:o="urn:schemas-microsoft-com:office:office" xmlns:r="http://schemas.openxmlformats.org/officeDocument/2006/relationships" xmlns:m="http://schemas.openxmlformats.org/officeDocument/2006/math" xmlns:v="urn:schemas-microsoft-com:vml" xmlns:wp14="http://schemas.microsoft.com/office/word/2010/wordprocessingDrawing" xmlns:wp="http://schemas.openxmlformats.org/drawingml/2006/wordprocessingDrawing" xmlns:w10="urn:schemas-microsoft-com:office:word" xmlns:w="http://schemas.openxmlformats.org/wordprocessingml/2006/main" xmlns:w14="http://schemas.microsoft.com/office/word/2010/wordml" xmlns:w15="http://schemas.microsoft.com/office/word/2012/wordml" xmlns:w16cid="http://schemas.microsoft.com/office/word/2016/wordml/cid" xmlns:w16se="http://schemas.microsoft.com/office/word/2015/wordml/symex" xmlns:wpg="http://schemas.microsoft.com/office/word/2010/wordprocessingGroup" xmlns:wpi="http://schemas.microsoft.com/office/word/2010/wordprocessingInk" xmlns:wne="http://schemas.microsoft.com/office/word/2006/wordml" xmlns:wps="http://schemas.microsoft.com/office/word/2010/wordprocessingShape" mc:Ignorable="w14 w15 w16se w16cid wp14">
   <w:abstractNum w:abstractNumId="0" w15:restartNumberingAfterBreak="0">
+    <w:nsid w:val="4AA96F7D"/>
+    <w:multiLevelType w:val="multilevel"/>
+    <w:tmpl w:val="E08ABC76"/>
+    <w:lvl w:ilvl="0">
+      <w:start w:val="1"/>
+      <w:numFmt w:val="decimal"/>
+      <w:lvlText w:val="%1."/>
+      <w:lvlJc w:val="left"/>
+      <w:pPr>
+        <w:tabs>
+          <w:tab w:val="num" w:pos="720"/>
+        </w:tabs>
+        <w:ind w:left="720" w:hanging="360"/>
+      </w:pPr>
+    </w:lvl>
+    <w:lvl w:ilvl="1" w:tentative="1">
+      <w:start w:val="1"/>
+      <w:numFmt w:val="decimal"/>
+      <w:lvlText w:val="%2."/>
+      <w:lvlJc w:val="left"/>
+      <w:pPr>
+        <w:tabs>
+          <w:tab w:val="num" w:pos="1440"/>
+        </w:tabs>
+        <w:ind w:left="1440" w:hanging="360"/>
+      </w:pPr>
+    </w:lvl>
+    <w:lvl w:ilvl="2" w:tentative="1">
+      <w:start w:val="1"/>
+      <w:numFmt w:val="decimal"/>
+      <w:lvlText w:val="%3."/>
+      <w:lvlJc w:val="left"/>
+      <w:pPr>
+        <w:tabs>
+          <w:tab w:val="num" w:pos="2160"/>
+        </w:tabs>
+        <w:ind w:left="2160" w:hanging="360"/>
+      </w:pPr>
+    </w:lvl>
+    <w:lvl w:ilvl="3" w:tentative="1">
+      <w:start w:val="1"/>
+      <w:numFmt w:val="decimal"/>
+      <w:lvlText w:val="%4."/>
+      <w:lvlJc w:val="left"/>
+      <w:pPr>
+        <w:tabs>
+          <w:tab w:val="num" w:pos="2880"/>
+        </w:tabs>
+        <w:ind w:left="2880" w:hanging="360"/>
+      </w:pPr>
+    </w:lvl>
+    <w:lvl w:ilvl="4" w:tentative="1">
+      <w:start w:val="1"/>
+      <w:numFmt w:val="decimal"/>
+      <w:lvlText w:val="%5."/>
+      <w:lvlJc w:val="left"/>
+      <w:pPr>
+        <w:tabs>
+          <w:tab w:val="num" w:pos="3600"/>
+        </w:tabs>
+        <w:ind w:left="3600" w:hanging="360"/>
+      </w:pPr>
+    </w:lvl>
+    <w:lvl w:ilvl="5" w:tentative="1">
+      <w:start w:val="1"/>
+      <w:numFmt w:val="decimal"/>
+      <w:lvlText w:val="%6."/>
+      <w:lvlJc w:val="left"/>
+      <w:pPr>
+        <w:tabs>
+          <w:tab w:val="num" w:pos="4320"/>
+        </w:tabs>
+        <w:ind w:left="4320" w:hanging="360"/>
+      </w:pPr>
+    </w:lvl>
+    <w:lvl w:ilvl="6" w:tentative="1">
+      <w:start w:val="1"/>
+      <w:numFmt w:val="decimal"/>
+      <w:lvlText w:val="%7."/>
+      <w:lvlJc w:val="left"/>
+      <w:pPr>
+        <w:tabs>
+          <w:tab w:val="num" w:pos="5040"/>
+        </w:tabs>
+        <w:ind w:left="5040" w:hanging="360"/>
+      </w:pPr>
+    </w:lvl>
+    <w:lvl w:ilvl="7" w:tentative="1">
+      <w:start w:val="1"/>
+      <w:numFmt w:val="decimal"/>
+      <w:lvlText w:val="%8."/>
+      <w:lvlJc w:val="left"/>
+      <w:pPr>
+        <w:tabs>
+          <w:tab w:val="num" w:pos="5760"/>
+        </w:tabs>
+        <w:ind w:left="5760" w:hanging="360"/>
+      </w:pPr>
+    </w:lvl>
+    <w:lvl w:ilvl="8" w:tentative="1">
+      <w:start w:val="1"/>
+      <w:numFmt w:val="decimal"/>
+      <w:lvlText w:val="%9."/>
+      <w:lvlJc w:val="left"/>
+      <w:pPr>
+        <w:tabs>
+          <w:tab w:val="num" w:pos="6480"/>
+        </w:tabs>
+        <w:ind w:left="6480" w:hanging="360"/>
+      </w:pPr>
+    </w:lvl>
+  </w:abstractNum>
+  <w:abstractNum w:abstractNumId="1" w15:restartNumberingAfterBreak="0">
     <w:nsid w:val="5965403B"/>
     <w:multiLevelType w:val="multilevel"/>
     <w:tmpl w:val="9E604DAA"/>
@@ -1817,7 +2673,7 @@
       </w:rPr>
     </w:lvl>
   </w:abstractNum>
-  <w:abstractNum w:abstractNumId="1" w15:restartNumberingAfterBreak="0">
+  <w:abstractNum w:abstractNumId="2" w15:restartNumberingAfterBreak="0">
     <w:nsid w:val="668B373E"/>
     <w:multiLevelType w:val="multilevel"/>
     <w:tmpl w:val="25D4B0F0"/>
@@ -1930,7 +2786,7 @@
       </w:pPr>
     </w:lvl>
   </w:abstractNum>
-  <w:abstractNum w:abstractNumId="2" w15:restartNumberingAfterBreak="0">
+  <w:abstractNum w:abstractNumId="3" w15:restartNumberingAfterBreak="0">
     <w:nsid w:val="7EC76C37"/>
     <w:multiLevelType w:val="multilevel"/>
     <w:tmpl w:val="835A76F4"/>
@@ -2048,13 +2904,16 @@
     </w:lvl>
   </w:abstractNum>
   <w:num w:numId="1">
+    <w:abstractNumId w:val="2"/>
+  </w:num>
+  <w:num w:numId="2">
     <w:abstractNumId w:val="1"/>
   </w:num>
-  <w:num w:numId="2">
+  <w:num w:numId="3">
+    <w:abstractNumId w:val="3"/>
+  </w:num>
+  <w:num w:numId="4">
     <w:abstractNumId w:val="0"/>
-  </w:num>
-  <w:num w:numId="3">
-    <w:abstractNumId w:val="2"/>
   </w:num>
 </w:numbering>
 </file>
@@ -2652,6 +3511,18 @@
       <w:szCs w:val="20"/>
     </w:rPr>
   </w:style>
+  <w:style w:type="character" w:styleId="Hyperlink">
+    <w:name w:val="Hyperlink"/>
+    <w:basedOn w:val="DefaultParagraphFont"/>
+    <w:uiPriority w:val="99"/>
+    <w:semiHidden/>
+    <w:unhideWhenUsed/>
+    <w:rsid w:val="00482C73"/>
+    <w:rPr>
+      <w:color w:val="0000FF"/>
+      <w:u w:val="single"/>
+    </w:rPr>
+  </w:style>
 </w:styles>
 </file>
 

</xml_diff>